<commit_message>
Group remaining collection IDs by recollection and new participants
</commit_message>
<xml_diff>
--- a/analysis_outputs/participant_exclusion_summary_20261021/time_pressure_reviewed_exclusions.docx
+++ b/analysis_outputs/participant_exclusion_summary_20261021/time_pressure_reviewed_exclusions.docx
@@ -412,7 +412,25 @@
     <w:p>
       <w:pPr/>
       <w:r>
-        <w:t>Uncollected allocations: 084, 088, 089, 090, 091, 092, 093, 094, 095 and 096 (10 participants).</w:t>
+        <w:rPr>
+          <w:b/>
+        </w:rPr>
+        <w:t xml:space="preserve">Re-collect: </w:t>
+      </w:r>
+      <w:r>
+        <w:t>004, 010 and 048 (3 participants).</w:t>
+      </w:r>
+    </w:p>
+    <w:p>
+      <w:pPr/>
+      <w:r>
+        <w:rPr>
+          <w:b/>
+        </w:rPr>
+        <w:t xml:space="preserve">New participants: </w:t>
+      </w:r>
+      <w:r>
+        <w:t>084, 088, 089, 090, 091, 092, 093, 094, 095 and 096 (10 participants; uncollected task IDs up to 096).</w:t>
       </w:r>
     </w:p>
     <w:p>
@@ -424,7 +442,7 @@
     <w:p>
       <w:pPr/>
       <w:r>
-        <w:t>If replacing the three excluded participants as well, add allocations 004, 010 and 048, bringing the total to 13 collections.</w:t>
+        <w:t>Total remaining: 13 collections (3 re-collections and 10 new participants).</w:t>
       </w:r>
     </w:p>
     <w:p>

</xml_diff>